<commit_message>
fix(documents): correct generated document data
</commit_message>
<xml_diff>
--- a/templates/documents/individual-assignment.docx
+++ b/templates/documents/individual-assignment.docx
@@ -115,14 +115,14 @@
                 <w:szCs w:val="28"/>
                 <w:u w:val="none"/>
               </w:rPr>
-              <w:t>«</w:t>
+              <w:t xml:space="preserve">{{practice_approval_date}}</w:t>
             </w:r>
             <w:r>
               <w:rPr>
                 <w:sz w:val="28"/>
                 <w:szCs w:val="28"/>
               </w:rPr>
-              <w:t>29</w:t>
+              <w:t/>
             </w:r>
             <w:r>
               <w:rPr>
@@ -130,14 +130,14 @@
                 <w:szCs w:val="28"/>
                 <w:u w:val="none"/>
               </w:rPr>
-              <w:t xml:space="preserve">» </w:t>
+              <w:t xml:space="preserve"/>
             </w:r>
             <w:r>
               <w:rPr>
                 <w:sz w:val="28"/>
                 <w:szCs w:val="28"/>
               </w:rPr>
-              <w:t>июня</w:t>
+              <w:t/>
             </w:r>
             <w:r>
               <w:rPr>
@@ -145,14 +145,14 @@
                 <w:szCs w:val="28"/>
                 <w:u w:val="none"/>
               </w:rPr>
-              <w:t xml:space="preserve"> 20</w:t>
+              <w:t xml:space="preserve"/>
             </w:r>
             <w:r>
               <w:rPr>
                 <w:sz w:val="28"/>
                 <w:szCs w:val="28"/>
               </w:rPr>
-              <w:t>26</w:t>
+              <w:t/>
             </w:r>
           </w:p>
         </w:tc>
@@ -207,14 +207,14 @@
                 <w:szCs w:val="28"/>
                 <w:u w:val="none"/>
               </w:rPr>
-              <w:t>«</w:t>
+              <w:t xml:space="preserve">{{practice_approval_date}}</w:t>
             </w:r>
             <w:r>
               <w:rPr>
                 <w:sz w:val="28"/>
                 <w:szCs w:val="28"/>
               </w:rPr>
-              <w:t>29</w:t>
+              <w:t/>
             </w:r>
             <w:r>
               <w:rPr>
@@ -222,14 +222,14 @@
                 <w:szCs w:val="28"/>
                 <w:u w:val="none"/>
               </w:rPr>
-              <w:t>»</w:t>
+              <w:t/>
             </w:r>
             <w:r>
               <w:rPr>
                 <w:sz w:val="28"/>
                 <w:szCs w:val="28"/>
               </w:rPr>
-              <w:t xml:space="preserve"> июня</w:t>
+              <w:t xml:space="preserve"/>
             </w:r>
             <w:r>
               <w:rPr>
@@ -237,14 +237,14 @@
                 <w:szCs w:val="28"/>
                 <w:u w:val="none"/>
               </w:rPr>
-              <w:t xml:space="preserve"> 20</w:t>
+              <w:t xml:space="preserve"/>
             </w:r>
             <w:r>
               <w:rPr>
                 <w:sz w:val="28"/>
                 <w:szCs w:val="28"/>
               </w:rPr>
-              <w:t>26</w:t>
+              <w:t/>
             </w:r>
           </w:p>
         </w:tc>
@@ -1436,7 +1436,7 @@
                 <w:szCs w:val="18"/>
                 <w:u w:val="none"/>
               </w:rPr>
-              <w:t xml:space="preserve">с   </w:t>
+              <w:t xml:space="preserve">с   {{organizational_start_date}}</w:t>
             </w:r>
             <w:r>
               <w:rPr>
@@ -1445,15 +1445,15 @@
                 <w:u w:val="none"/>
                 <w:lang w:val="ru-RU"/>
               </w:rPr>
-              <w:t>29</w:t>
-            </w:r>
-            <w:r>
-              <w:rPr>
-                <w:sz w:val="18"/>
-                <w:szCs w:val="18"/>
-                <w:u w:val="none"/>
-              </w:rPr>
-              <w:t>.</w:t>
+              <w:t/>
+            </w:r>
+            <w:r>
+              <w:rPr>
+                <w:sz w:val="18"/>
+                <w:szCs w:val="18"/>
+                <w:u w:val="none"/>
+              </w:rPr>
+              <w:t/>
             </w:r>
             <w:r>
               <w:rPr>
@@ -1462,15 +1462,15 @@
                 <w:u w:val="none"/>
                 <w:lang w:val="ru-RU"/>
               </w:rPr>
-              <w:t>06</w:t>
-            </w:r>
-            <w:r>
-              <w:rPr>
-                <w:sz w:val="18"/>
-                <w:szCs w:val="18"/>
-                <w:u w:val="none"/>
-              </w:rPr>
-              <w:t>.</w:t>
+              <w:t/>
+            </w:r>
+            <w:r>
+              <w:rPr>
+                <w:sz w:val="18"/>
+                <w:szCs w:val="18"/>
+                <w:u w:val="none"/>
+              </w:rPr>
+              <w:t/>
             </w:r>
             <w:r>
               <w:rPr>
@@ -1479,7 +1479,7 @@
                 <w:u w:val="none"/>
                 <w:lang w:val="ru-RU"/>
               </w:rPr>
-              <w:t>2026</w:t>
+              <w:t/>
             </w:r>
           </w:p>
           <w:p>
@@ -1516,7 +1516,7 @@
                 <w:szCs w:val="18"/>
                 <w:u w:val="none"/>
               </w:rPr>
-              <w:t xml:space="preserve">по </w:t>
+              <w:t xml:space="preserve">по {{organizational_end_date}}</w:t>
             </w:r>
             <w:r>
               <w:rPr>
@@ -1525,15 +1525,15 @@
                 <w:u w:val="none"/>
                 <w:lang w:val="ru-RU"/>
               </w:rPr>
-              <w:t>06</w:t>
-            </w:r>
-            <w:r>
-              <w:rPr>
-                <w:sz w:val="18"/>
-                <w:szCs w:val="18"/>
-                <w:u w:val="none"/>
-              </w:rPr>
-              <w:t>.</w:t>
+              <w:t/>
+            </w:r>
+            <w:r>
+              <w:rPr>
+                <w:sz w:val="18"/>
+                <w:szCs w:val="18"/>
+                <w:u w:val="none"/>
+              </w:rPr>
+              <w:t/>
             </w:r>
             <w:r>
               <w:rPr>
@@ -1542,7 +1542,7 @@
                 <w:u w:val="none"/>
                 <w:lang w:val="ru-RU"/>
               </w:rPr>
-              <w:t>07.2026</w:t>
+              <w:t/>
             </w:r>
           </w:p>
         </w:tc>
@@ -1799,7 +1799,7 @@
                 <w:szCs w:val="18"/>
                 <w:u w:val="none"/>
               </w:rPr>
-              <w:t xml:space="preserve">с   </w:t>
+              <w:t xml:space="preserve">с   {{main_start_date}}</w:t>
             </w:r>
             <w:r>
               <w:rPr>
@@ -1808,15 +1808,15 @@
                 <w:u w:val="none"/>
                 <w:lang w:val="ru-RU"/>
               </w:rPr>
-              <w:t>06</w:t>
-            </w:r>
-            <w:r>
-              <w:rPr>
-                <w:sz w:val="18"/>
-                <w:szCs w:val="18"/>
-                <w:u w:val="none"/>
-              </w:rPr>
-              <w:t>.</w:t>
+              <w:t/>
+            </w:r>
+            <w:r>
+              <w:rPr>
+                <w:sz w:val="18"/>
+                <w:szCs w:val="18"/>
+                <w:u w:val="none"/>
+              </w:rPr>
+              <w:t/>
             </w:r>
             <w:r>
               <w:rPr>
@@ -1825,15 +1825,15 @@
                 <w:u w:val="none"/>
                 <w:lang w:val="ru-RU"/>
               </w:rPr>
-              <w:t>07</w:t>
-            </w:r>
-            <w:r>
-              <w:rPr>
-                <w:sz w:val="18"/>
-                <w:szCs w:val="18"/>
-                <w:u w:val="none"/>
-              </w:rPr>
-              <w:t>.</w:t>
+              <w:t/>
+            </w:r>
+            <w:r>
+              <w:rPr>
+                <w:sz w:val="18"/>
+                <w:szCs w:val="18"/>
+                <w:u w:val="none"/>
+              </w:rPr>
+              <w:t/>
             </w:r>
             <w:r>
               <w:rPr>
@@ -1842,7 +1842,7 @@
                 <w:u w:val="none"/>
                 <w:lang w:val="ru-RU"/>
               </w:rPr>
-              <w:t>2026</w:t>
+              <w:t/>
             </w:r>
           </w:p>
           <w:p>
@@ -1861,7 +1861,7 @@
                 <w:szCs w:val="18"/>
                 <w:u w:val="none"/>
               </w:rPr>
-              <w:t xml:space="preserve">по </w:t>
+              <w:t xml:space="preserve">по {{main_end_date}}</w:t>
             </w:r>
             <w:r>
               <w:rPr>
@@ -1870,15 +1870,15 @@
                 <w:u w:val="none"/>
                 <w:lang w:val="ru-RU"/>
               </w:rPr>
-              <w:t>22</w:t>
-            </w:r>
-            <w:r>
-              <w:rPr>
-                <w:sz w:val="18"/>
-                <w:szCs w:val="18"/>
-                <w:u w:val="none"/>
-              </w:rPr>
-              <w:t>.</w:t>
+              <w:t/>
+            </w:r>
+            <w:r>
+              <w:rPr>
+                <w:sz w:val="18"/>
+                <w:szCs w:val="18"/>
+                <w:u w:val="none"/>
+              </w:rPr>
+              <w:t/>
             </w:r>
             <w:r>
               <w:rPr>
@@ -1887,15 +1887,15 @@
                 <w:u w:val="none"/>
                 <w:lang w:val="ru-RU"/>
               </w:rPr>
-              <w:t>07</w:t>
-            </w:r>
-            <w:r>
-              <w:rPr>
-                <w:sz w:val="18"/>
-                <w:szCs w:val="18"/>
-                <w:u w:val="none"/>
-              </w:rPr>
-              <w:t>.</w:t>
+              <w:t/>
+            </w:r>
+            <w:r>
+              <w:rPr>
+                <w:sz w:val="18"/>
+                <w:szCs w:val="18"/>
+                <w:u w:val="none"/>
+              </w:rPr>
+              <w:t/>
             </w:r>
             <w:r>
               <w:rPr>
@@ -1904,7 +1904,7 @@
                 <w:u w:val="none"/>
                 <w:lang w:val="ru-RU"/>
               </w:rPr>
-              <w:t>2026</w:t>
+              <w:t/>
             </w:r>
           </w:p>
         </w:tc>
@@ -2021,7 +2021,7 @@
                 <w:szCs w:val="18"/>
                 <w:u w:val="none"/>
               </w:rPr>
-              <w:t xml:space="preserve">с   </w:t>
+              <w:t xml:space="preserve">с   {{final_start_date}}</w:t>
             </w:r>
             <w:r>
               <w:rPr>
@@ -2030,15 +2030,15 @@
                 <w:u w:val="none"/>
                 <w:lang w:val="ru-RU"/>
               </w:rPr>
-              <w:t>23</w:t>
-            </w:r>
-            <w:r>
-              <w:rPr>
-                <w:sz w:val="18"/>
-                <w:szCs w:val="18"/>
-                <w:u w:val="none"/>
-              </w:rPr>
-              <w:t>.</w:t>
+              <w:t/>
+            </w:r>
+            <w:r>
+              <w:rPr>
+                <w:sz w:val="18"/>
+                <w:szCs w:val="18"/>
+                <w:u w:val="none"/>
+              </w:rPr>
+              <w:t/>
             </w:r>
             <w:r>
               <w:rPr>
@@ -2047,15 +2047,15 @@
                 <w:u w:val="none"/>
                 <w:lang w:val="ru-RU"/>
               </w:rPr>
-              <w:t>07</w:t>
-            </w:r>
-            <w:r>
-              <w:rPr>
-                <w:sz w:val="18"/>
-                <w:szCs w:val="18"/>
-                <w:u w:val="none"/>
-              </w:rPr>
-              <w:t>.</w:t>
+              <w:t/>
+            </w:r>
+            <w:r>
+              <w:rPr>
+                <w:sz w:val="18"/>
+                <w:szCs w:val="18"/>
+                <w:u w:val="none"/>
+              </w:rPr>
+              <w:t/>
             </w:r>
             <w:r>
               <w:rPr>
@@ -2064,7 +2064,7 @@
                 <w:u w:val="none"/>
                 <w:lang w:val="ru-RU"/>
               </w:rPr>
-              <w:t>2026</w:t>
+              <w:t/>
             </w:r>
           </w:p>
           <w:p>
@@ -2083,7 +2083,7 @@
                 <w:szCs w:val="18"/>
                 <w:u w:val="none"/>
               </w:rPr>
-              <w:t xml:space="preserve">по </w:t>
+              <w:t xml:space="preserve">по {{final_end_date}}</w:t>
             </w:r>
             <w:r>
               <w:rPr>
@@ -2092,15 +2092,15 @@
                 <w:u w:val="none"/>
                 <w:lang w:val="ru-RU"/>
               </w:rPr>
-              <w:t>26</w:t>
-            </w:r>
-            <w:r>
-              <w:rPr>
-                <w:sz w:val="18"/>
-                <w:szCs w:val="18"/>
-                <w:u w:val="none"/>
-              </w:rPr>
-              <w:t>.</w:t>
+              <w:t/>
+            </w:r>
+            <w:r>
+              <w:rPr>
+                <w:sz w:val="18"/>
+                <w:szCs w:val="18"/>
+                <w:u w:val="none"/>
+              </w:rPr>
+              <w:t/>
             </w:r>
             <w:r>
               <w:rPr>
@@ -2109,15 +2109,15 @@
                 <w:u w:val="none"/>
                 <w:lang w:val="ru-RU"/>
               </w:rPr>
-              <w:t>07</w:t>
-            </w:r>
-            <w:r>
-              <w:rPr>
-                <w:sz w:val="18"/>
-                <w:szCs w:val="18"/>
-                <w:u w:val="none"/>
-              </w:rPr>
-              <w:t>.</w:t>
+              <w:t/>
+            </w:r>
+            <w:r>
+              <w:rPr>
+                <w:sz w:val="18"/>
+                <w:szCs w:val="18"/>
+                <w:u w:val="none"/>
+              </w:rPr>
+              <w:t/>
             </w:r>
             <w:r>
               <w:rPr>
@@ -2126,7 +2126,7 @@
                 <w:u w:val="none"/>
                 <w:lang w:val="ru-RU"/>
               </w:rPr>
-              <w:t>2026</w:t>
+              <w:t/>
             </w:r>
           </w:p>
           <w:p>

</xml_diff>

<commit_message>
docs(templates): update profile placeholders
</commit_message>
<xml_diff>
--- a/templates/documents/individual-assignment.docx
+++ b/templates/documents/individual-assignment.docx
@@ -115,44 +115,7 @@
                 <w:szCs w:val="28"/>
                 <w:u w:val="none"/>
               </w:rPr>
-              <w:t xml:space="preserve">{{practice_approval_date}}</w:t>
-            </w:r>
-            <w:r>
-              <w:rPr>
-                <w:sz w:val="28"/>
-                <w:szCs w:val="28"/>
-              </w:rPr>
-              <w:t/>
-            </w:r>
-            <w:r>
-              <w:rPr>
-                <w:sz w:val="28"/>
-                <w:szCs w:val="28"/>
-                <w:u w:val="none"/>
-              </w:rPr>
-              <w:t xml:space="preserve"/>
-            </w:r>
-            <w:r>
-              <w:rPr>
-                <w:sz w:val="28"/>
-                <w:szCs w:val="28"/>
-              </w:rPr>
-              <w:t/>
-            </w:r>
-            <w:r>
-              <w:rPr>
-                <w:sz w:val="28"/>
-                <w:szCs w:val="28"/>
-                <w:u w:val="none"/>
-              </w:rPr>
-              <w:t xml:space="preserve"/>
-            </w:r>
-            <w:r>
-              <w:rPr>
-                <w:sz w:val="28"/>
-                <w:szCs w:val="28"/>
-              </w:rPr>
-              <w:t/>
+              <w:t>{{practice_approval_date}}</w:t>
             </w:r>
           </w:p>
         </w:tc>
@@ -166,6 +129,7 @@
                 <w:sz w:val="28"/>
                 <w:szCs w:val="28"/>
                 <w:u w:val="none"/>
+                <w:lang w:val="en-US"/>
               </w:rPr>
             </w:pPr>
             <w:r>
@@ -183,6 +147,7 @@
                 <w:sz w:val="28"/>
                 <w:szCs w:val="28"/>
                 <w:u w:val="none"/>
+                <w:lang w:val="en-US"/>
               </w:rPr>
             </w:pPr>
             <w:r>
@@ -190,8 +155,17 @@
                 <w:sz w:val="28"/>
                 <w:szCs w:val="28"/>
                 <w:u w:val="none"/>
-              </w:rPr>
-              <w:t xml:space="preserve"> УрФУ</w:t>
+                <w:lang w:val="en-US"/>
+              </w:rPr>
+              <w:t xml:space="preserve"> </w:t>
+            </w:r>
+            <w:r>
+              <w:rPr>
+                <w:sz w:val="28"/>
+                <w:szCs w:val="28"/>
+                <w:u w:val="none"/>
+              </w:rPr>
+              <w:t>УрФУ</w:t>
             </w:r>
           </w:p>
           <w:p>
@@ -199,6 +173,7 @@
               <w:rPr>
                 <w:sz w:val="28"/>
                 <w:szCs w:val="28"/>
+                <w:lang w:val="en-US"/>
               </w:rPr>
             </w:pPr>
             <w:r>
@@ -206,45 +181,29 @@
                 <w:sz w:val="28"/>
                 <w:szCs w:val="28"/>
                 <w:u w:val="none"/>
-              </w:rPr>
-              <w:t xml:space="preserve">{{practice_approval_date}}</w:t>
-            </w:r>
+                <w:lang w:val="en-US"/>
+              </w:rPr>
+              <w:t>{{</w:t>
+            </w:r>
+            <w:proofErr w:type="spellStart"/>
             <w:r>
               <w:rPr>
                 <w:sz w:val="28"/>
                 <w:szCs w:val="28"/>
-              </w:rPr>
-              <w:t/>
-            </w:r>
+                <w:u w:val="none"/>
+                <w:lang w:val="en-US"/>
+              </w:rPr>
+              <w:t>practice_approval_date</w:t>
+            </w:r>
+            <w:proofErr w:type="spellEnd"/>
             <w:r>
               <w:rPr>
                 <w:sz w:val="28"/>
                 <w:szCs w:val="28"/>
                 <w:u w:val="none"/>
-              </w:rPr>
-              <w:t/>
-            </w:r>
-            <w:r>
-              <w:rPr>
-                <w:sz w:val="28"/>
-                <w:szCs w:val="28"/>
-              </w:rPr>
-              <w:t xml:space="preserve"/>
-            </w:r>
-            <w:r>
-              <w:rPr>
-                <w:sz w:val="28"/>
-                <w:szCs w:val="28"/>
-                <w:u w:val="none"/>
-              </w:rPr>
-              <w:t xml:space="preserve"/>
-            </w:r>
-            <w:r>
-              <w:rPr>
-                <w:sz w:val="28"/>
-                <w:szCs w:val="28"/>
-              </w:rPr>
-              <w:t/>
+                <w:lang w:val="en-US"/>
+              </w:rPr>
+              <w:t>}}</w:t>
             </w:r>
           </w:p>
         </w:tc>
@@ -285,12 +244,21 @@
               </w:rPr>
               <w:t xml:space="preserve">__________              </w:t>
             </w:r>
+            <w:proofErr w:type="spellStart"/>
             <w:r>
               <w:rPr>
                 <w:color w:val="000000"/>
                 <w:lang w:val="ru-RU"/>
               </w:rPr>
-              <w:t>Езуб Антон Сергеевич</w:t>
+              <w:t>Езуб</w:t>
+            </w:r>
+            <w:proofErr w:type="spellEnd"/>
+            <w:r>
+              <w:rPr>
+                <w:color w:val="000000"/>
+                <w:lang w:val="ru-RU"/>
+              </w:rPr>
+              <w:t xml:space="preserve"> Антон Сергеевич</w:t>
             </w:r>
           </w:p>
           <w:p>
@@ -387,25 +355,69 @@
               <w:rPr>
                 <w:color w:val="000000"/>
                 <w:u w:val="none"/>
+                <w:lang w:val="en-US"/>
               </w:rPr>
             </w:pPr>
             <w:r>
               <w:rPr>
                 <w:color w:val="000000"/>
                 <w:u w:val="none"/>
-              </w:rPr>
-              <w:t xml:space="preserve">__________                   </w:t>
-            </w:r>
+                <w:lang w:val="en-US"/>
+              </w:rPr>
+              <w:t xml:space="preserve">__________                 </w:t>
+            </w:r>
+            <w:proofErr w:type="gramStart"/>
             <w:r>
               <w:rPr>
                 <w:color w:val="000000"/>
-              </w:rPr>
-              <w:t xml:space="preserve"> Е. М. Корнякова</w:t>
+                <w:u w:val="none"/>
+                <w:lang w:val="en-US"/>
+              </w:rPr>
+              <w:t xml:space="preserve">  </w:t>
             </w:r>
             <w:r>
               <w:rPr>
                 <w:color w:val="000000"/>
-                <w:u w:val="none"/>
+                <w:lang w:val="en-US"/>
+              </w:rPr>
+              <w:t xml:space="preserve"> </w:t>
+            </w:r>
+            <w:r>
+              <w:rPr>
+                <w:color w:val="000000"/>
+                <w:lang w:val="en-US"/>
+              </w:rPr>
+              <w:t>{</w:t>
+            </w:r>
+            <w:proofErr w:type="gramEnd"/>
+            <w:r>
+              <w:rPr>
+                <w:color w:val="000000"/>
+                <w:lang w:val="en-US"/>
+              </w:rPr>
+              <w:t>{</w:t>
+            </w:r>
+            <w:proofErr w:type="spellStart"/>
+            <w:r>
+              <w:rPr>
+                <w:color w:val="000000"/>
+                <w:lang w:val="en-US"/>
+              </w:rPr>
+              <w:t>urfu_practice_supervisor_short_name</w:t>
+            </w:r>
+            <w:proofErr w:type="spellEnd"/>
+            <w:r>
+              <w:rPr>
+                <w:color w:val="000000"/>
+                <w:lang w:val="en-US"/>
+              </w:rPr>
+              <w:t>}}</w:t>
+            </w:r>
+            <w:r>
+              <w:rPr>
+                <w:color w:val="000000"/>
+                <w:u w:val="none"/>
+                <w:lang w:val="en-US"/>
               </w:rPr>
               <w:t xml:space="preserve"> </w:t>
             </w:r>
@@ -432,6 +444,7 @@
                 <w:szCs w:val="16"/>
                 <w:u w:val="none"/>
                 <w:vertAlign w:val="superscript"/>
+                <w:lang w:val="en-US"/>
               </w:rPr>
               <w:t xml:space="preserve">         </w:t>
             </w:r>
@@ -441,6 +454,7 @@
                 <w:szCs w:val="16"/>
                 <w:u w:val="none"/>
                 <w:vertAlign w:val="superscript"/>
+                <w:lang w:val="en-US"/>
               </w:rPr>
               <w:t xml:space="preserve">   </w:t>
             </w:r>
@@ -572,7 +586,7 @@
         <w:rPr>
           <w:lang w:val="en-US"/>
         </w:rPr>
-        <w:t>student</w:t>
+        <w:t>direction</w:t>
       </w:r>
       <w:r>
         <w:rPr>
@@ -584,13 +598,52 @@
         <w:rPr>
           <w:lang w:val="en-US"/>
         </w:rPr>
-        <w:t>specialty</w:t>
+        <w:t>co</w:t>
+      </w:r>
+      <w:r>
+        <w:rPr>
+          <w:lang w:val="en-US"/>
+        </w:rPr>
+        <w:t>d</w:t>
+      </w:r>
+      <w:r>
+        <w:rPr>
+          <w:lang w:val="en-US"/>
+        </w:rPr>
+        <w:t>e</w:t>
       </w:r>
       <w:r>
         <w:rPr>
           <w:lang w:val="ru-RU"/>
         </w:rPr>
         <w:t>}}</w:t>
+      </w:r>
+      <w:r>
+        <w:t xml:space="preserve"> {{</w:t>
+      </w:r>
+      <w:r>
+        <w:rPr>
+          <w:lang w:val="en-US"/>
+        </w:rPr>
+        <w:t>direction</w:t>
+      </w:r>
+      <w:r>
+        <w:t>_</w:t>
+      </w:r>
+      <w:r>
+        <w:rPr>
+          <w:lang w:val="en-US"/>
+        </w:rPr>
+        <w:t>name</w:t>
+      </w:r>
+      <w:r>
+        <w:t>}}</w:t>
+      </w:r>
+      <w:r>
+        <w:rPr>
+          <w:lang w:val="ru-RU"/>
+        </w:rPr>
+        <w:t xml:space="preserve"> </w:t>
       </w:r>
     </w:p>
     <w:p>
@@ -687,7 +740,7 @@
           <w:sz w:val="28"/>
           <w:szCs w:val="28"/>
           <w:u w:val="none"/>
-          <w:lang w:val="ru-RU"/>
+          <w:lang w:val="en-US"/>
         </w:rPr>
       </w:pPr>
       <w:r>
@@ -697,10 +750,11 @@
           <w:sz w:val="28"/>
           <w:szCs w:val="28"/>
           <w:u w:val="none"/>
-          <w:lang w:val="ru-RU"/>
+          <w:lang w:val="en-US"/>
         </w:rPr>
         <w:t>{{</w:t>
       </w:r>
+      <w:proofErr w:type="spellStart"/>
       <w:r>
         <w:rPr>
           <w:b/>
@@ -719,7 +773,7 @@
           <w:sz w:val="28"/>
           <w:szCs w:val="28"/>
           <w:u w:val="none"/>
-          <w:lang w:val="ru-RU"/>
+          <w:lang w:val="en-US"/>
         </w:rPr>
         <w:t>_</w:t>
       </w:r>
@@ -741,7 +795,7 @@
           <w:sz w:val="28"/>
           <w:szCs w:val="28"/>
           <w:u w:val="none"/>
-          <w:lang w:val="ru-RU"/>
+          <w:lang w:val="en-US"/>
         </w:rPr>
         <w:t>_</w:t>
       </w:r>
@@ -754,7 +808,7 @@
           <w:u w:val="none"/>
           <w:lang w:val="en-US"/>
         </w:rPr>
-        <w:t>name</w:t>
+        <w:t>n</w:t>
       </w:r>
       <w:r>
         <w:rPr>
@@ -763,7 +817,19 @@
           <w:sz w:val="28"/>
           <w:szCs w:val="28"/>
           <w:u w:val="none"/>
-          <w:lang w:val="ru-RU"/>
+          <w:lang w:val="en-US"/>
+        </w:rPr>
+        <w:t>ame_genitive</w:t>
+      </w:r>
+      <w:proofErr w:type="spellEnd"/>
+      <w:r>
+        <w:rPr>
+          <w:b/>
+          <w:bCs/>
+          <w:sz w:val="28"/>
+          <w:szCs w:val="28"/>
+          <w:u w:val="none"/>
+          <w:lang w:val="en-US"/>
         </w:rPr>
         <w:t>}}</w:t>
       </w:r>
@@ -775,6 +841,7 @@
           <w:sz w:val="16"/>
           <w:szCs w:val="16"/>
           <w:u w:val="none"/>
+          <w:lang w:val="en-US"/>
         </w:rPr>
       </w:pPr>
       <w:r>
@@ -782,8 +849,60 @@
           <w:sz w:val="16"/>
           <w:szCs w:val="16"/>
           <w:u w:val="none"/>
-        </w:rPr>
-        <w:t>(фамилия, имя, отчество)</w:t>
+          <w:lang w:val="en-US"/>
+        </w:rPr>
+        <w:t>(</w:t>
+      </w:r>
+      <w:r>
+        <w:rPr>
+          <w:sz w:val="16"/>
+          <w:szCs w:val="16"/>
+          <w:u w:val="none"/>
+        </w:rPr>
+        <w:t>фамилия</w:t>
+      </w:r>
+      <w:r>
+        <w:rPr>
+          <w:sz w:val="16"/>
+          <w:szCs w:val="16"/>
+          <w:u w:val="none"/>
+          <w:lang w:val="en-US"/>
+        </w:rPr>
+        <w:t xml:space="preserve">, </w:t>
+      </w:r>
+      <w:r>
+        <w:rPr>
+          <w:sz w:val="16"/>
+          <w:szCs w:val="16"/>
+          <w:u w:val="none"/>
+        </w:rPr>
+        <w:t>имя</w:t>
+      </w:r>
+      <w:r>
+        <w:rPr>
+          <w:sz w:val="16"/>
+          <w:szCs w:val="16"/>
+          <w:u w:val="none"/>
+          <w:lang w:val="en-US"/>
+        </w:rPr>
+        <w:t xml:space="preserve">, </w:t>
+      </w:r>
+      <w:r>
+        <w:rPr>
+          <w:sz w:val="16"/>
+          <w:szCs w:val="16"/>
+          <w:u w:val="none"/>
+        </w:rPr>
+        <w:t>отчество</w:t>
+      </w:r>
+      <w:r>
+        <w:rPr>
+          <w:sz w:val="16"/>
+          <w:szCs w:val="16"/>
+          <w:u w:val="none"/>
+          <w:lang w:val="en-US"/>
+        </w:rPr>
+        <w:t>)</w:t>
       </w:r>
     </w:p>
     <w:p>
@@ -1427,7 +1546,7 @@
                 <w:sz w:val="18"/>
                 <w:szCs w:val="18"/>
                 <w:u w:val="none"/>
-                <w:lang w:val="ru-RU"/>
+                <w:lang w:val="en-US"/>
               </w:rPr>
             </w:pPr>
             <w:r>
@@ -1436,50 +1555,47 @@
                 <w:szCs w:val="18"/>
                 <w:u w:val="none"/>
               </w:rPr>
-              <w:t xml:space="preserve">с   {{organizational_start_date}}</w:t>
-            </w:r>
-            <w:r>
-              <w:rPr>
-                <w:sz w:val="18"/>
-                <w:szCs w:val="18"/>
-                <w:u w:val="none"/>
-                <w:lang w:val="ru-RU"/>
-              </w:rPr>
-              <w:t/>
-            </w:r>
-            <w:r>
-              <w:rPr>
-                <w:sz w:val="18"/>
-                <w:szCs w:val="18"/>
-                <w:u w:val="none"/>
-              </w:rPr>
-              <w:t/>
-            </w:r>
-            <w:r>
-              <w:rPr>
-                <w:sz w:val="18"/>
-                <w:szCs w:val="18"/>
-                <w:u w:val="none"/>
-                <w:lang w:val="ru-RU"/>
-              </w:rPr>
-              <w:t/>
-            </w:r>
-            <w:r>
-              <w:rPr>
-                <w:sz w:val="18"/>
-                <w:szCs w:val="18"/>
-                <w:u w:val="none"/>
-              </w:rPr>
-              <w:t/>
-            </w:r>
-            <w:r>
-              <w:rPr>
-                <w:sz w:val="18"/>
-                <w:szCs w:val="18"/>
-                <w:u w:val="none"/>
-                <w:lang w:val="ru-RU"/>
-              </w:rPr>
-              <w:t/>
+              <w:t>с</w:t>
+            </w:r>
+            <w:proofErr w:type="gramStart"/>
+            <w:r>
+              <w:rPr>
+                <w:sz w:val="18"/>
+                <w:szCs w:val="18"/>
+                <w:u w:val="none"/>
+                <w:lang w:val="en-US"/>
+              </w:rPr>
+              <w:t xml:space="preserve">   {</w:t>
+            </w:r>
+            <w:proofErr w:type="gramEnd"/>
+            <w:r>
+              <w:rPr>
+                <w:sz w:val="18"/>
+                <w:szCs w:val="18"/>
+                <w:u w:val="none"/>
+                <w:lang w:val="en-US"/>
+              </w:rPr>
+              <w:t>{</w:t>
+            </w:r>
+            <w:proofErr w:type="spellStart"/>
+            <w:r>
+              <w:rPr>
+                <w:sz w:val="18"/>
+                <w:szCs w:val="18"/>
+                <w:u w:val="none"/>
+                <w:lang w:val="en-US"/>
+              </w:rPr>
+              <w:t>organizational_start_date</w:t>
+            </w:r>
+            <w:proofErr w:type="spellEnd"/>
+            <w:r>
+              <w:rPr>
+                <w:sz w:val="18"/>
+                <w:szCs w:val="18"/>
+                <w:u w:val="none"/>
+                <w:lang w:val="en-US"/>
+              </w:rPr>
+              <w:t>}}</w:t>
             </w:r>
           </w:p>
           <w:p>
@@ -1489,6 +1605,7 @@
                 <w:sz w:val="18"/>
                 <w:szCs w:val="18"/>
                 <w:u w:val="none"/>
+                <w:lang w:val="en-US"/>
               </w:rPr>
             </w:pPr>
             <w:r>
@@ -1496,8 +1613,60 @@
                 <w:sz w:val="18"/>
                 <w:szCs w:val="18"/>
                 <w:u w:val="none"/>
-              </w:rPr>
-              <w:t>(дата начала    практики)</w:t>
+                <w:lang w:val="en-US"/>
+              </w:rPr>
+              <w:t>(</w:t>
+            </w:r>
+            <w:r>
+              <w:rPr>
+                <w:sz w:val="18"/>
+                <w:szCs w:val="18"/>
+                <w:u w:val="none"/>
+              </w:rPr>
+              <w:t>дата</w:t>
+            </w:r>
+            <w:r>
+              <w:rPr>
+                <w:sz w:val="18"/>
+                <w:szCs w:val="18"/>
+                <w:u w:val="none"/>
+                <w:lang w:val="en-US"/>
+              </w:rPr>
+              <w:t xml:space="preserve"> </w:t>
+            </w:r>
+            <w:r>
+              <w:rPr>
+                <w:sz w:val="18"/>
+                <w:szCs w:val="18"/>
+                <w:u w:val="none"/>
+              </w:rPr>
+              <w:t>начала</w:t>
+            </w:r>
+            <w:r>
+              <w:rPr>
+                <w:sz w:val="18"/>
+                <w:szCs w:val="18"/>
+                <w:u w:val="none"/>
+                <w:lang w:val="en-US"/>
+              </w:rPr>
+              <w:t xml:space="preserve">    </w:t>
+            </w:r>
+            <w:r>
+              <w:rPr>
+                <w:sz w:val="18"/>
+                <w:szCs w:val="18"/>
+                <w:u w:val="none"/>
+              </w:rPr>
+              <w:t>практики</w:t>
+            </w:r>
+            <w:r>
+              <w:rPr>
+                <w:sz w:val="18"/>
+                <w:szCs w:val="18"/>
+                <w:u w:val="none"/>
+                <w:lang w:val="en-US"/>
+              </w:rPr>
+              <w:t>)</w:t>
             </w:r>
           </w:p>
           <w:p>
@@ -1507,7 +1676,7 @@
                 <w:sz w:val="18"/>
                 <w:szCs w:val="18"/>
                 <w:u w:val="none"/>
-                <w:lang w:val="ru-RU"/>
+                <w:lang w:val="en-US"/>
               </w:rPr>
             </w:pPr>
             <w:r>
@@ -1516,33 +1685,36 @@
                 <w:szCs w:val="18"/>
                 <w:u w:val="none"/>
               </w:rPr>
-              <w:t xml:space="preserve">по {{organizational_end_date}}</w:t>
-            </w:r>
-            <w:r>
-              <w:rPr>
-                <w:sz w:val="18"/>
-                <w:szCs w:val="18"/>
-                <w:u w:val="none"/>
-                <w:lang w:val="ru-RU"/>
-              </w:rPr>
-              <w:t/>
-            </w:r>
-            <w:r>
-              <w:rPr>
-                <w:sz w:val="18"/>
-                <w:szCs w:val="18"/>
-                <w:u w:val="none"/>
-              </w:rPr>
-              <w:t/>
-            </w:r>
-            <w:r>
-              <w:rPr>
-                <w:sz w:val="18"/>
-                <w:szCs w:val="18"/>
-                <w:u w:val="none"/>
-                <w:lang w:val="ru-RU"/>
-              </w:rPr>
-              <w:t/>
+              <w:t>по</w:t>
+            </w:r>
+            <w:r>
+              <w:rPr>
+                <w:sz w:val="18"/>
+                <w:szCs w:val="18"/>
+                <w:u w:val="none"/>
+                <w:lang w:val="en-US"/>
+              </w:rPr>
+              <w:t xml:space="preserve"> {{</w:t>
+            </w:r>
+            <w:proofErr w:type="spellStart"/>
+            <w:r>
+              <w:rPr>
+                <w:sz w:val="18"/>
+                <w:szCs w:val="18"/>
+                <w:u w:val="none"/>
+                <w:lang w:val="en-US"/>
+              </w:rPr>
+              <w:t>organizational_end_date</w:t>
+            </w:r>
+            <w:proofErr w:type="spellEnd"/>
+            <w:r>
+              <w:rPr>
+                <w:sz w:val="18"/>
+                <w:szCs w:val="18"/>
+                <w:u w:val="none"/>
+                <w:lang w:val="en-US"/>
+              </w:rPr>
+              <w:t>}}</w:t>
             </w:r>
           </w:p>
         </w:tc>
@@ -1605,176 +1777,20 @@
           <w:p>
             <w:pPr>
               <w:rPr>
+                <w:sz w:val="18"/>
+                <w:szCs w:val="18"/>
+                <w:u w:val="none"/>
+                <w:lang w:val="en-US"/>
+              </w:rPr>
+            </w:pPr>
+            <w:r>
+              <w:rPr>
                 <w:sz w:val="16"/>
                 <w:szCs w:val="16"/>
                 <w:u w:val="none"/>
-              </w:rPr>
-            </w:pPr>
-            <w:r>
-              <w:rPr>
-                <w:sz w:val="16"/>
-                <w:szCs w:val="16"/>
-                <w:u w:val="none"/>
-              </w:rPr>
-              <w:t xml:space="preserve">Выполнение индивидуального задания по следующему перечню работ: </w:t>
-            </w:r>
-          </w:p>
-          <w:p>
-            <w:pPr>
-              <w:rPr>
-                <w:sz w:val="16"/>
-                <w:szCs w:val="16"/>
-                <w:u w:val="none"/>
-                <w:lang w:val="ru-RU"/>
-              </w:rPr>
-            </w:pPr>
-            <w:bookmarkStart w:id="1" w:name="_heading=h.fesdl4hp3li7" w:colFirst="0" w:colLast="0"/>
-            <w:bookmarkEnd w:id="1"/>
-            <w:r>
-              <w:rPr>
-                <w:sz w:val="16"/>
-                <w:szCs w:val="16"/>
-                <w:u w:val="none"/>
-              </w:rPr>
-              <w:t>1</w:t>
-            </w:r>
-            <w:r>
-              <w:rPr>
-                <w:sz w:val="16"/>
-                <w:szCs w:val="16"/>
-                <w:u w:val="none"/>
-                <w:lang w:val="ru-RU"/>
-              </w:rPr>
-              <w:t xml:space="preserve">. Изучение архитектуры разрабатываемой системы и освоение рабочего процесса с применением </w:t>
-            </w:r>
-            <w:r>
-              <w:rPr>
-                <w:sz w:val="16"/>
-                <w:szCs w:val="16"/>
-                <w:u w:val="none"/>
-                <w:lang w:val="en-US"/>
-              </w:rPr>
-              <w:t>AI</w:t>
-            </w:r>
-            <w:r>
-              <w:rPr>
-                <w:sz w:val="16"/>
-                <w:szCs w:val="16"/>
-                <w:u w:val="none"/>
-                <w:lang w:val="ru-RU"/>
-              </w:rPr>
-              <w:t>-инструментов (</w:t>
-            </w:r>
-            <w:r>
-              <w:rPr>
-                <w:sz w:val="16"/>
-                <w:szCs w:val="16"/>
-                <w:u w:val="none"/>
-                <w:lang w:val="en-US"/>
-              </w:rPr>
-              <w:t>Cursor</w:t>
-            </w:r>
-            <w:r>
-              <w:rPr>
-                <w:sz w:val="16"/>
-                <w:szCs w:val="16"/>
-                <w:u w:val="none"/>
-                <w:lang w:val="ru-RU"/>
-              </w:rPr>
-              <w:t xml:space="preserve">, </w:t>
-            </w:r>
-            <w:r>
-              <w:rPr>
-                <w:sz w:val="16"/>
-                <w:szCs w:val="16"/>
-                <w:u w:val="none"/>
-                <w:lang w:val="en-US"/>
-              </w:rPr>
-              <w:t>Claude</w:t>
-            </w:r>
-            <w:r>
-              <w:rPr>
-                <w:sz w:val="16"/>
-                <w:szCs w:val="16"/>
-                <w:u w:val="none"/>
-                <w:lang w:val="ru-RU"/>
-              </w:rPr>
-              <w:t xml:space="preserve"> </w:t>
-            </w:r>
-            <w:r>
-              <w:rPr>
-                <w:sz w:val="16"/>
-                <w:szCs w:val="16"/>
-                <w:u w:val="none"/>
-                <w:lang w:val="en-US"/>
-              </w:rPr>
-              <w:t>Code</w:t>
-            </w:r>
-            <w:r>
-              <w:rPr>
-                <w:sz w:val="16"/>
-                <w:szCs w:val="16"/>
-                <w:u w:val="none"/>
-                <w:lang w:val="ru-RU"/>
-              </w:rPr>
-              <w:t>).</w:t>
-            </w:r>
-          </w:p>
-          <w:p>
-            <w:pPr>
-              <w:rPr>
-                <w:sz w:val="16"/>
-                <w:szCs w:val="16"/>
-                <w:u w:val="none"/>
-                <w:lang w:val="ru-RU"/>
-              </w:rPr>
-            </w:pPr>
-            <w:r>
-              <w:rPr>
-                <w:sz w:val="16"/>
-                <w:szCs w:val="16"/>
-                <w:u w:val="none"/>
-                <w:lang w:val="ru-RU"/>
-              </w:rPr>
-              <w:t>2. Разработка и интеграция программных модулей пользовательского интерфейса в соответствии с поставленными задачами.</w:t>
-            </w:r>
-          </w:p>
-          <w:p>
-            <w:pPr>
-              <w:rPr>
-                <w:sz w:val="16"/>
-                <w:szCs w:val="16"/>
-                <w:u w:val="none"/>
-                <w:lang w:val="ru-RU"/>
-              </w:rPr>
-            </w:pPr>
-            <w:r>
-              <w:rPr>
-                <w:sz w:val="16"/>
-                <w:szCs w:val="16"/>
-                <w:u w:val="none"/>
-                <w:lang w:val="ru-RU"/>
-              </w:rPr>
-              <w:t>3. Тестирование и отладка реализованного функционала, исправление выявленных дефектов.</w:t>
-            </w:r>
-          </w:p>
-          <w:p>
-            <w:pPr>
-              <w:rPr>
-                <w:sz w:val="18"/>
-                <w:szCs w:val="18"/>
-                <w:u w:val="none"/>
-                <w:lang w:val="ru-RU"/>
-              </w:rPr>
-            </w:pPr>
-            <w:r>
-              <w:rPr>
-                <w:sz w:val="16"/>
-                <w:szCs w:val="16"/>
-                <w:u w:val="none"/>
-                <w:lang w:val="ru-RU"/>
-              </w:rPr>
-              <w:t>4. Подготовка технической документации и оформление результатов выполненной работы.</w:t>
+                <w:lang w:val="en-US"/>
+              </w:rPr>
+              <w:t>{{main_stage_work_list}}</w:t>
             </w:r>
           </w:p>
         </w:tc>
@@ -1790,7 +1806,7 @@
                 <w:sz w:val="18"/>
                 <w:szCs w:val="18"/>
                 <w:u w:val="none"/>
-                <w:lang w:val="ru-RU"/>
+                <w:lang w:val="en-US"/>
               </w:rPr>
             </w:pPr>
             <w:r>
@@ -1799,50 +1815,47 @@
                 <w:szCs w:val="18"/>
                 <w:u w:val="none"/>
               </w:rPr>
-              <w:t xml:space="preserve">с   {{main_start_date}}</w:t>
-            </w:r>
-            <w:r>
-              <w:rPr>
-                <w:sz w:val="18"/>
-                <w:szCs w:val="18"/>
-                <w:u w:val="none"/>
-                <w:lang w:val="ru-RU"/>
-              </w:rPr>
-              <w:t/>
-            </w:r>
-            <w:r>
-              <w:rPr>
-                <w:sz w:val="18"/>
-                <w:szCs w:val="18"/>
-                <w:u w:val="none"/>
-              </w:rPr>
-              <w:t/>
-            </w:r>
-            <w:r>
-              <w:rPr>
-                <w:sz w:val="18"/>
-                <w:szCs w:val="18"/>
-                <w:u w:val="none"/>
-                <w:lang w:val="ru-RU"/>
-              </w:rPr>
-              <w:t/>
-            </w:r>
-            <w:r>
-              <w:rPr>
-                <w:sz w:val="18"/>
-                <w:szCs w:val="18"/>
-                <w:u w:val="none"/>
-              </w:rPr>
-              <w:t/>
-            </w:r>
-            <w:r>
-              <w:rPr>
-                <w:sz w:val="18"/>
-                <w:szCs w:val="18"/>
-                <w:u w:val="none"/>
-                <w:lang w:val="ru-RU"/>
-              </w:rPr>
-              <w:t/>
+              <w:t>с</w:t>
+            </w:r>
+            <w:proofErr w:type="gramStart"/>
+            <w:r>
+              <w:rPr>
+                <w:sz w:val="18"/>
+                <w:szCs w:val="18"/>
+                <w:u w:val="none"/>
+                <w:lang w:val="en-US"/>
+              </w:rPr>
+              <w:t xml:space="preserve">   {</w:t>
+            </w:r>
+            <w:proofErr w:type="gramEnd"/>
+            <w:r>
+              <w:rPr>
+                <w:sz w:val="18"/>
+                <w:szCs w:val="18"/>
+                <w:u w:val="none"/>
+                <w:lang w:val="en-US"/>
+              </w:rPr>
+              <w:t>{</w:t>
+            </w:r>
+            <w:proofErr w:type="spellStart"/>
+            <w:r>
+              <w:rPr>
+                <w:sz w:val="18"/>
+                <w:szCs w:val="18"/>
+                <w:u w:val="none"/>
+                <w:lang w:val="en-US"/>
+              </w:rPr>
+              <w:t>main_start_date</w:t>
+            </w:r>
+            <w:proofErr w:type="spellEnd"/>
+            <w:r>
+              <w:rPr>
+                <w:sz w:val="18"/>
+                <w:szCs w:val="18"/>
+                <w:u w:val="none"/>
+                <w:lang w:val="en-US"/>
+              </w:rPr>
+              <w:t>}}</w:t>
             </w:r>
           </w:p>
           <w:p>
@@ -1852,7 +1865,7 @@
                 <w:sz w:val="18"/>
                 <w:szCs w:val="18"/>
                 <w:u w:val="none"/>
-                <w:lang w:val="ru-RU"/>
+                <w:lang w:val="en-US"/>
               </w:rPr>
             </w:pPr>
             <w:r>
@@ -1861,50 +1874,36 @@
                 <w:szCs w:val="18"/>
                 <w:u w:val="none"/>
               </w:rPr>
-              <w:t xml:space="preserve">по {{main_end_date}}</w:t>
-            </w:r>
-            <w:r>
-              <w:rPr>
-                <w:sz w:val="18"/>
-                <w:szCs w:val="18"/>
-                <w:u w:val="none"/>
-                <w:lang w:val="ru-RU"/>
-              </w:rPr>
-              <w:t/>
-            </w:r>
-            <w:r>
-              <w:rPr>
-                <w:sz w:val="18"/>
-                <w:szCs w:val="18"/>
-                <w:u w:val="none"/>
-              </w:rPr>
-              <w:t/>
-            </w:r>
-            <w:r>
-              <w:rPr>
-                <w:sz w:val="18"/>
-                <w:szCs w:val="18"/>
-                <w:u w:val="none"/>
-                <w:lang w:val="ru-RU"/>
-              </w:rPr>
-              <w:t/>
-            </w:r>
-            <w:r>
-              <w:rPr>
-                <w:sz w:val="18"/>
-                <w:szCs w:val="18"/>
-                <w:u w:val="none"/>
-              </w:rPr>
-              <w:t/>
-            </w:r>
-            <w:r>
-              <w:rPr>
-                <w:sz w:val="18"/>
-                <w:szCs w:val="18"/>
-                <w:u w:val="none"/>
-                <w:lang w:val="ru-RU"/>
-              </w:rPr>
-              <w:t/>
+              <w:t>по</w:t>
+            </w:r>
+            <w:r>
+              <w:rPr>
+                <w:sz w:val="18"/>
+                <w:szCs w:val="18"/>
+                <w:u w:val="none"/>
+                <w:lang w:val="en-US"/>
+              </w:rPr>
+              <w:t xml:space="preserve"> {{</w:t>
+            </w:r>
+            <w:proofErr w:type="spellStart"/>
+            <w:r>
+              <w:rPr>
+                <w:sz w:val="18"/>
+                <w:szCs w:val="18"/>
+                <w:u w:val="none"/>
+                <w:lang w:val="en-US"/>
+              </w:rPr>
+              <w:t>main_end_date</w:t>
+            </w:r>
+            <w:proofErr w:type="spellEnd"/>
+            <w:r>
+              <w:rPr>
+                <w:sz w:val="18"/>
+                <w:szCs w:val="18"/>
+                <w:u w:val="none"/>
+                <w:lang w:val="en-US"/>
+              </w:rPr>
+              <w:t>}}</w:t>
             </w:r>
           </w:p>
         </w:tc>
@@ -2012,7 +2011,7 @@
                 <w:sz w:val="18"/>
                 <w:szCs w:val="18"/>
                 <w:u w:val="none"/>
-                <w:lang w:val="ru-RU"/>
+                <w:lang w:val="en-US"/>
               </w:rPr>
             </w:pPr>
             <w:r>
@@ -2021,50 +2020,47 @@
                 <w:szCs w:val="18"/>
                 <w:u w:val="none"/>
               </w:rPr>
-              <w:t xml:space="preserve">с   {{final_start_date}}</w:t>
-            </w:r>
-            <w:r>
-              <w:rPr>
-                <w:sz w:val="18"/>
-                <w:szCs w:val="18"/>
-                <w:u w:val="none"/>
-                <w:lang w:val="ru-RU"/>
-              </w:rPr>
-              <w:t/>
-            </w:r>
-            <w:r>
-              <w:rPr>
-                <w:sz w:val="18"/>
-                <w:szCs w:val="18"/>
-                <w:u w:val="none"/>
-              </w:rPr>
-              <w:t/>
-            </w:r>
-            <w:r>
-              <w:rPr>
-                <w:sz w:val="18"/>
-                <w:szCs w:val="18"/>
-                <w:u w:val="none"/>
-                <w:lang w:val="ru-RU"/>
-              </w:rPr>
-              <w:t/>
-            </w:r>
-            <w:r>
-              <w:rPr>
-                <w:sz w:val="18"/>
-                <w:szCs w:val="18"/>
-                <w:u w:val="none"/>
-              </w:rPr>
-              <w:t/>
-            </w:r>
-            <w:r>
-              <w:rPr>
-                <w:sz w:val="18"/>
-                <w:szCs w:val="18"/>
-                <w:u w:val="none"/>
-                <w:lang w:val="ru-RU"/>
-              </w:rPr>
-              <w:t/>
+              <w:t>с</w:t>
+            </w:r>
+            <w:proofErr w:type="gramStart"/>
+            <w:r>
+              <w:rPr>
+                <w:sz w:val="18"/>
+                <w:szCs w:val="18"/>
+                <w:u w:val="none"/>
+                <w:lang w:val="en-US"/>
+              </w:rPr>
+              <w:t xml:space="preserve">   {</w:t>
+            </w:r>
+            <w:proofErr w:type="gramEnd"/>
+            <w:r>
+              <w:rPr>
+                <w:sz w:val="18"/>
+                <w:szCs w:val="18"/>
+                <w:u w:val="none"/>
+                <w:lang w:val="en-US"/>
+              </w:rPr>
+              <w:t>{</w:t>
+            </w:r>
+            <w:proofErr w:type="spellStart"/>
+            <w:r>
+              <w:rPr>
+                <w:sz w:val="18"/>
+                <w:szCs w:val="18"/>
+                <w:u w:val="none"/>
+                <w:lang w:val="en-US"/>
+              </w:rPr>
+              <w:t>final_start_date</w:t>
+            </w:r>
+            <w:proofErr w:type="spellEnd"/>
+            <w:r>
+              <w:rPr>
+                <w:sz w:val="18"/>
+                <w:szCs w:val="18"/>
+                <w:u w:val="none"/>
+                <w:lang w:val="en-US"/>
+              </w:rPr>
+              <w:t>}}</w:t>
             </w:r>
           </w:p>
           <w:p>
@@ -2074,7 +2070,7 @@
                 <w:sz w:val="18"/>
                 <w:szCs w:val="18"/>
                 <w:u w:val="none"/>
-                <w:lang w:val="ru-RU"/>
+                <w:lang w:val="en-US"/>
               </w:rPr>
             </w:pPr>
             <w:r>
@@ -2083,50 +2079,36 @@
                 <w:szCs w:val="18"/>
                 <w:u w:val="none"/>
               </w:rPr>
-              <w:t xml:space="preserve">по {{final_end_date}}</w:t>
-            </w:r>
-            <w:r>
-              <w:rPr>
-                <w:sz w:val="18"/>
-                <w:szCs w:val="18"/>
-                <w:u w:val="none"/>
-                <w:lang w:val="ru-RU"/>
-              </w:rPr>
-              <w:t/>
-            </w:r>
-            <w:r>
-              <w:rPr>
-                <w:sz w:val="18"/>
-                <w:szCs w:val="18"/>
-                <w:u w:val="none"/>
-              </w:rPr>
-              <w:t/>
-            </w:r>
-            <w:r>
-              <w:rPr>
-                <w:sz w:val="18"/>
-                <w:szCs w:val="18"/>
-                <w:u w:val="none"/>
-                <w:lang w:val="ru-RU"/>
-              </w:rPr>
-              <w:t/>
-            </w:r>
-            <w:r>
-              <w:rPr>
-                <w:sz w:val="18"/>
-                <w:szCs w:val="18"/>
-                <w:u w:val="none"/>
-              </w:rPr>
-              <w:t/>
-            </w:r>
-            <w:r>
-              <w:rPr>
-                <w:sz w:val="18"/>
-                <w:szCs w:val="18"/>
-                <w:u w:val="none"/>
-                <w:lang w:val="ru-RU"/>
-              </w:rPr>
-              <w:t/>
+              <w:t>по</w:t>
+            </w:r>
+            <w:r>
+              <w:rPr>
+                <w:sz w:val="18"/>
+                <w:szCs w:val="18"/>
+                <w:u w:val="none"/>
+                <w:lang w:val="en-US"/>
+              </w:rPr>
+              <w:t xml:space="preserve"> {{</w:t>
+            </w:r>
+            <w:proofErr w:type="spellStart"/>
+            <w:r>
+              <w:rPr>
+                <w:sz w:val="18"/>
+                <w:szCs w:val="18"/>
+                <w:u w:val="none"/>
+                <w:lang w:val="en-US"/>
+              </w:rPr>
+              <w:t>final_end_date</w:t>
+            </w:r>
+            <w:proofErr w:type="spellEnd"/>
+            <w:r>
+              <w:rPr>
+                <w:sz w:val="18"/>
+                <w:szCs w:val="18"/>
+                <w:u w:val="none"/>
+                <w:lang w:val="en-US"/>
+              </w:rPr>
+              <w:t>}}</w:t>
             </w:r>
           </w:p>
           <w:p>
@@ -2277,11 +2259,79 @@
         </w:rPr>
         <w:t xml:space="preserve"> __________                </w:t>
       </w:r>
-      <w:r>
-        <w:rPr>
-          <w:color w:val="000000"/>
-        </w:rPr>
-        <w:t xml:space="preserve">Корнякова Елена Михайловна   </w:t>
+      <w:proofErr w:type="gramStart"/>
+      <w:r>
+        <w:rPr>
+          <w:color w:val="000000"/>
+          <w:u w:val="none"/>
+          <w:lang w:val="ru-RU"/>
+        </w:rPr>
+        <w:t xml:space="preserve">   </w:t>
+      </w:r>
+      <w:r>
+        <w:rPr>
+          <w:color w:val="000000"/>
+          <w:lang w:val="ru-RU"/>
+        </w:rPr>
+        <w:t>{</w:t>
+      </w:r>
+      <w:proofErr w:type="gramEnd"/>
+      <w:r>
+        <w:rPr>
+          <w:color w:val="000000"/>
+          <w:lang w:val="ru-RU"/>
+        </w:rPr>
+        <w:t>{</w:t>
+      </w:r>
+      <w:proofErr w:type="spellStart"/>
+      <w:r>
+        <w:rPr>
+          <w:color w:val="000000"/>
+          <w:lang w:val="en-US"/>
+        </w:rPr>
+        <w:t>urfu</w:t>
+      </w:r>
+      <w:proofErr w:type="spellEnd"/>
+      <w:r>
+        <w:rPr>
+          <w:color w:val="000000"/>
+          <w:lang w:val="ru-RU"/>
+        </w:rPr>
+        <w:t>_</w:t>
+      </w:r>
+      <w:r>
+        <w:rPr>
+          <w:color w:val="000000"/>
+          <w:lang w:val="en-US"/>
+        </w:rPr>
+        <w:t>practice</w:t>
+      </w:r>
+      <w:r>
+        <w:rPr>
+          <w:color w:val="000000"/>
+          <w:lang w:val="ru-RU"/>
+        </w:rPr>
+        <w:t>_</w:t>
+      </w:r>
+      <w:r>
+        <w:rPr>
+          <w:color w:val="000000"/>
+          <w:lang w:val="en-US"/>
+        </w:rPr>
+        <w:t>supervisor</w:t>
+      </w:r>
+      <w:r>
+        <w:rPr>
+          <w:color w:val="000000"/>
+          <w:lang w:val="ru-RU"/>
+        </w:rPr>
+        <w:t>}}</w:t>
+      </w:r>
+      <w:r>
+        <w:rPr>
+          <w:color w:val="000000"/>
+        </w:rPr>
+        <w:t xml:space="preserve">   </w:t>
       </w:r>
     </w:p>
     <w:p>
@@ -2386,14 +2436,23 @@
           <w:u w:val="none"/>
           <w:lang w:val="ru-RU"/>
         </w:rPr>
-        <w:t xml:space="preserve">           </w:t>
-      </w:r>
-      <w:r>
-        <w:rPr>
-          <w:color w:val="000000"/>
-          <w:lang w:val="ru-RU"/>
-        </w:rPr>
-        <w:t>Езуб Антон Сергеевич</w:t>
+        <w:t xml:space="preserve">       </w:t>
+      </w:r>
+      <w:proofErr w:type="spellStart"/>
+      <w:r>
+        <w:rPr>
+          <w:color w:val="000000"/>
+          <w:lang w:val="ru-RU"/>
+        </w:rPr>
+        <w:t>Езуб</w:t>
+      </w:r>
+      <w:proofErr w:type="spellEnd"/>
+      <w:r>
+        <w:rPr>
+          <w:color w:val="000000"/>
+          <w:lang w:val="ru-RU"/>
+        </w:rPr>
+        <w:t xml:space="preserve"> Антон Сергеевич</w:t>
       </w:r>
     </w:p>
     <w:p>

</xml_diff>